<commit_message>
R6 csmext: separate CSM pack replaced with Grant's second version (15:20)
Adds angry and disappointed at journey and channel level, call-centre and IVR
diagnostics, pooled All_Waves files, label and MR set CSVs and the pack's own
validators; the two top-level Claude instruction documents of the first version are
replaced by each sector's 03 instructions.

Co-Authored-By: Claude Opus 5.5 <noreply@anthropic.com>
Claude-Session: https://claude.ai/code/session_01LiQx9kY8mBk8Gex9468mTo
</commit_message>
<xml_diff>
--- a/fixtures/packs-2026-10-30/csm/banking/00_CSM_Research_Brief.docx
+++ b/fixtures/packs-2026-10-30/csm/banking/00_CSM_Research_Brief.docx
@@ -5,147 +5,1310 @@
     <w:p>
       <w:pPr>
         <w:pStyle w:val="Title"/>
-        <w:spacing w:after="60"/>
       </w:pPr>
       <w:r>
-        <w:rPr>
-          <w:color w:val="000000"/>
-        </w:rPr>
-        <w:t>FNB customer satisfaction tracking brief</w:t>
+        <w:t>South African banking separate CSM research brief</w:t>
       </w:r>
     </w:p>
     <w:p>
       <w:pPr>
-        <w:spacing w:after="60"/>
+        <w:pStyle w:val="Subtitle"/>
       </w:pPr>
       <w:r>
-        <w:t>Mock Research and Customer Experience Manager brief | Three-wave commissioning request</w:t>
+        <w:t>Two linked current customer instruments and three independent survey waves</w:t>
       </w:r>
     </w:p>
     <w:p>
       <w:pPr>
-        <w:spacing w:after="60"/>
+        <w:spacing w:after="80" w:line="240" w:lineRule="auto"/>
       </w:pPr>
       <w:r>
-        <w:t>We need a tracker that tells us how customers judge FNB overall and what happens when they use specific channels. We do not want a company score driven only by recent call-centre users. This is a fictional brief for a synthetic dataset, not an instruction issued by the named company.</w:t>
+        <w:t>The research team needs a coherent tracker for company relationships and recent channel experiences. Keep two linked instruments and data grains: one Respondents row per current customer, and one Experiences row per latest used channel experience. This is a fictional FNB commissioning brief for synthetic demonstration data, not an instruction issued by that company.</w:t>
       </w:r>
     </w:p>
     <w:p>
       <w:pPr>
         <w:pStyle w:val="Heading1"/>
-        <w:spacing w:after="60" w:before="120"/>
       </w:pPr>
       <w:r>
-        <w:rPr>
-          <w:color w:val="000000"/>
-        </w:rPr>
-        <w:t>Decisions and objectives</w:t>
+        <w:t>Decisions and measurement objectives</w:t>
       </w:r>
     </w:p>
     <w:p>
       <w:pPr>
-        <w:spacing w:after="60"/>
+        <w:spacing w:after="80" w:line="240" w:lineRule="auto"/>
       </w:pPr>
       <w:r>
-        <w:t>Identify relationship strengths and risks, channel failures, priority service improvements and groups requiring further investigation. Track overall satisfaction, service quality, value, fairness, recommendation, continuing-use intention and switching risk. For recent encounters, measure satisfaction, ease, task completion, resolution, repeat contact, waiting, IVR and staff treatment.</w:t>
+        <w:t>Identify relationship strengths, switching risks, service failures and priorities for investigation. Cover company satisfaction, expectations, service performance and importance, fairness, trust, recommendation, continuing use, complaints and stated switching intentions. Recent channel modules cover satisfaction, ease, task completion, resolution, repeated contact, waiting, IVR, staff treatment and physical facilities where applicable.</w:t>
       </w:r>
     </w:p>
     <w:p>
       <w:pPr>
-        <w:spacing w:after="60"/>
+        <w:spacing w:after="80" w:line="240" w:lineRule="auto"/>
       </w:pPr>
       <w:r>
-        <w:t>The additive expansion also measures continuity across one anchored task, emotional outcomes and their reasons, experience-led preference, and reasons for continuing use. It separates genuine preference from habit, contractual barriers, switching inconvenience and lack of alternatives. Comparable competitor evidence requires personal recent use of the same task type; expectations come from a separate noncustomer sample.</w:t>
+        <w:t>Preserve the expanded anchored journey, channel continuity, emotions and explanations, experience led preference and staying reasons. Add anger and disappointment alongside reassurance, feeling valued, frustration and anxiety, plus fuller call centre and IVR diagnostics. Preference can coexist with habit or switching constraints. Competitive evidence requires personal recent use of the same task type.</w:t>
       </w:r>
     </w:p>
     <w:p>
       <w:pPr>
         <w:pStyle w:val="Heading1"/>
-        <w:spacing w:after="60" w:before="120"/>
       </w:pPr>
       <w:r>
-        <w:rPr>
-          <w:color w:val="000000"/>
-        </w:rPr>
-        <w:t>Design</w:t>
+        <w:t>Population and sample</w:t>
       </w:r>
     </w:p>
     <w:p>
       <w:pPr>
-        <w:spacing w:after="60"/>
+        <w:spacing w:after="80" w:line="240" w:lineRule="auto"/>
       </w:pPr>
       <w:r>
-        <w:t>Adults 18–69 who currently use a personal banking account. Evaluate the bank used for most day-to-day banking, not every bank held. Exclude business-only banking.</w:t>
+        <w:t>Adults aged 18 to 69 who currently use a personal banking account. Rate the bank used for most day to day banking, not every bank held. Exclude business only banking.</w:t>
       </w:r>
     </w:p>
     <w:p>
       <w:pPr>
-        <w:spacing w:after="60"/>
+        <w:spacing w:after="80" w:line="240" w:lineRule="auto"/>
       </w:pPr>
       <w:r>
-        <w:t>Commission three independent waves with 1,000 current customers per wave. Ask company measures first. Then screen channel use over 30 days and assess the most recent interaction in each used channel. Report one relationship record per person and separate channel records linked by ID. A person with four channel experiences still counts once in company scores. The illustrative comparative sample includes other companies, with fixed disclosed allocations; it is not a population market-share design.</w:t>
+        <w:t>Use three independent waves of 1,000 current customers each, with illustrative field periods in February, June and October 2026. These are repeated cross sections, not a panel. Keep the fixed provider allocations below; they are demonstration quotas, not market shares.</w:t>
+      </w:r>
+    </w:p>
+    <w:tbl>
+      <w:tblPr>
+        <w:tblW w:type="auto" w:w="0"/>
+        <w:jc w:val="center"/>
+        <w:tblLayout w:type="fixed"/>
+        <w:tblLook w:firstColumn="1" w:firstRow="1" w:lastColumn="0" w:lastRow="0" w:noHBand="0" w:noVBand="1" w:val="04A0"/>
+      </w:tblPr>
+      <w:tblGrid>
+        <w:gridCol w:w="792"/>
+        <w:gridCol w:w="6624"/>
+        <w:gridCol w:w="2232"/>
+      </w:tblGrid>
+      <w:tr>
+        <w:trPr>
+          <w:cantSplit/>
+          <w:tblHeader/>
+        </w:trPr>
+        <w:tc>
+          <w:tcPr>
+            <w:tcW w:type="dxa" w:w="792"/>
+            <w:vAlign w:val="center"/>
+            <w:tcMar>
+              <w:top w:w="70" w:type="dxa"/>
+              <w:left w:w="70" w:type="dxa"/>
+              <w:bottom w:w="70" w:type="dxa"/>
+              <w:right w:w="70" w:type="dxa"/>
+            </w:tcMar>
+            <w:shd w:fill="EDEDED"/>
+          </w:tcPr>
+          <w:p>
+            <w:pPr>
+              <w:spacing w:after="40" w:before="40"/>
+            </w:pPr>
+            <w:r>
+              <w:rPr>
+                <w:rFonts w:ascii="Arial" w:hAnsi="Arial"/>
+                <w:b/>
+                <w:color w:val="000000"/>
+                <w:sz w:val="22"/>
+              </w:rPr>
+              <w:t>Code</w:t>
+            </w:r>
+          </w:p>
+        </w:tc>
+        <w:tc>
+          <w:tcPr>
+            <w:tcW w:type="dxa" w:w="6624"/>
+            <w:vAlign w:val="center"/>
+            <w:tcMar>
+              <w:top w:w="70" w:type="dxa"/>
+              <w:left w:w="70" w:type="dxa"/>
+              <w:bottom w:w="70" w:type="dxa"/>
+              <w:right w:w="70" w:type="dxa"/>
+            </w:tcMar>
+            <w:shd w:fill="EDEDED"/>
+          </w:tcPr>
+          <w:p>
+            <w:pPr>
+              <w:spacing w:after="40" w:before="40"/>
+            </w:pPr>
+            <w:r>
+              <w:rPr>
+                <w:rFonts w:ascii="Arial" w:hAnsi="Arial"/>
+                <w:b/>
+                <w:color w:val="000000"/>
+                <w:sz w:val="22"/>
+              </w:rPr>
+              <w:t>Main provider</w:t>
+            </w:r>
+          </w:p>
+        </w:tc>
+        <w:tc>
+          <w:tcPr>
+            <w:tcW w:type="dxa" w:w="2232"/>
+            <w:vAlign w:val="center"/>
+            <w:tcMar>
+              <w:top w:w="70" w:type="dxa"/>
+              <w:left w:w="70" w:type="dxa"/>
+              <w:bottom w:w="70" w:type="dxa"/>
+              <w:right w:w="70" w:type="dxa"/>
+            </w:tcMar>
+            <w:shd w:fill="EDEDED"/>
+          </w:tcPr>
+          <w:p>
+            <w:pPr>
+              <w:spacing w:after="40" w:before="40"/>
+            </w:pPr>
+            <w:r>
+              <w:rPr>
+                <w:rFonts w:ascii="Arial" w:hAnsi="Arial"/>
+                <w:b/>
+                <w:color w:val="000000"/>
+                <w:sz w:val="22"/>
+              </w:rPr>
+              <w:t>Cases per wave</w:t>
+            </w:r>
+          </w:p>
+        </w:tc>
+      </w:tr>
+      <w:tr>
+        <w:trPr>
+          <w:cantSplit/>
+        </w:trPr>
+        <w:tc>
+          <w:tcPr>
+            <w:tcW w:type="dxa" w:w="792"/>
+            <w:vAlign w:val="center"/>
+            <w:tcMar>
+              <w:top w:w="70" w:type="dxa"/>
+              <w:left w:w="70" w:type="dxa"/>
+              <w:bottom w:w="70" w:type="dxa"/>
+              <w:right w:w="70" w:type="dxa"/>
+            </w:tcMar>
+          </w:tcPr>
+          <w:p>
+            <w:pPr>
+              <w:spacing w:after="40" w:before="40"/>
+            </w:pPr>
+            <w:r>
+              <w:rPr>
+                <w:rFonts w:ascii="Arial" w:hAnsi="Arial"/>
+                <w:b w:val="0"/>
+                <w:color w:val="000000"/>
+                <w:sz w:val="22"/>
+              </w:rPr>
+              <w:t>1</w:t>
+            </w:r>
+          </w:p>
+        </w:tc>
+        <w:tc>
+          <w:tcPr>
+            <w:tcW w:type="dxa" w:w="6624"/>
+            <w:vAlign w:val="center"/>
+            <w:tcMar>
+              <w:top w:w="70" w:type="dxa"/>
+              <w:left w:w="70" w:type="dxa"/>
+              <w:bottom w:w="70" w:type="dxa"/>
+              <w:right w:w="70" w:type="dxa"/>
+            </w:tcMar>
+          </w:tcPr>
+          <w:p>
+            <w:pPr>
+              <w:spacing w:after="40" w:before="40"/>
+            </w:pPr>
+            <w:r>
+              <w:rPr>
+                <w:rFonts w:ascii="Arial" w:hAnsi="Arial"/>
+                <w:b w:val="0"/>
+                <w:color w:val="000000"/>
+                <w:sz w:val="22"/>
+              </w:rPr>
+              <w:t>FNB</w:t>
+            </w:r>
+          </w:p>
+        </w:tc>
+        <w:tc>
+          <w:tcPr>
+            <w:tcW w:type="dxa" w:w="2232"/>
+            <w:vAlign w:val="center"/>
+            <w:tcMar>
+              <w:top w:w="70" w:type="dxa"/>
+              <w:left w:w="70" w:type="dxa"/>
+              <w:bottom w:w="70" w:type="dxa"/>
+              <w:right w:w="70" w:type="dxa"/>
+            </w:tcMar>
+          </w:tcPr>
+          <w:p>
+            <w:pPr>
+              <w:spacing w:after="40" w:before="40"/>
+            </w:pPr>
+            <w:r>
+              <w:rPr>
+                <w:rFonts w:ascii="Arial" w:hAnsi="Arial"/>
+                <w:b w:val="0"/>
+                <w:color w:val="000000"/>
+                <w:sz w:val="22"/>
+              </w:rPr>
+              <w:t>200</w:t>
+            </w:r>
+          </w:p>
+        </w:tc>
+      </w:tr>
+      <w:tr>
+        <w:trPr>
+          <w:cantSplit/>
+        </w:trPr>
+        <w:tc>
+          <w:tcPr>
+            <w:tcW w:type="dxa" w:w="792"/>
+            <w:vAlign w:val="center"/>
+            <w:tcMar>
+              <w:top w:w="70" w:type="dxa"/>
+              <w:left w:w="70" w:type="dxa"/>
+              <w:bottom w:w="70" w:type="dxa"/>
+              <w:right w:w="70" w:type="dxa"/>
+            </w:tcMar>
+          </w:tcPr>
+          <w:p>
+            <w:pPr>
+              <w:spacing w:after="40" w:before="40"/>
+            </w:pPr>
+            <w:r>
+              <w:rPr>
+                <w:rFonts w:ascii="Arial" w:hAnsi="Arial"/>
+                <w:b w:val="0"/>
+                <w:color w:val="000000"/>
+                <w:sz w:val="22"/>
+              </w:rPr>
+              <w:t>2</w:t>
+            </w:r>
+          </w:p>
+        </w:tc>
+        <w:tc>
+          <w:tcPr>
+            <w:tcW w:type="dxa" w:w="6624"/>
+            <w:vAlign w:val="center"/>
+            <w:tcMar>
+              <w:top w:w="70" w:type="dxa"/>
+              <w:left w:w="70" w:type="dxa"/>
+              <w:bottom w:w="70" w:type="dxa"/>
+              <w:right w:w="70" w:type="dxa"/>
+            </w:tcMar>
+          </w:tcPr>
+          <w:p>
+            <w:pPr>
+              <w:spacing w:after="40" w:before="40"/>
+            </w:pPr>
+            <w:r>
+              <w:rPr>
+                <w:rFonts w:ascii="Arial" w:hAnsi="Arial"/>
+                <w:b w:val="0"/>
+                <w:color w:val="000000"/>
+                <w:sz w:val="22"/>
+              </w:rPr>
+              <w:t>Standard Bank</w:t>
+            </w:r>
+          </w:p>
+        </w:tc>
+        <w:tc>
+          <w:tcPr>
+            <w:tcW w:type="dxa" w:w="2232"/>
+            <w:vAlign w:val="center"/>
+            <w:tcMar>
+              <w:top w:w="70" w:type="dxa"/>
+              <w:left w:w="70" w:type="dxa"/>
+              <w:bottom w:w="70" w:type="dxa"/>
+              <w:right w:w="70" w:type="dxa"/>
+            </w:tcMar>
+          </w:tcPr>
+          <w:p>
+            <w:pPr>
+              <w:spacing w:after="40" w:before="40"/>
+            </w:pPr>
+            <w:r>
+              <w:rPr>
+                <w:rFonts w:ascii="Arial" w:hAnsi="Arial"/>
+                <w:b w:val="0"/>
+                <w:color w:val="000000"/>
+                <w:sz w:val="22"/>
+              </w:rPr>
+              <w:t>160</w:t>
+            </w:r>
+          </w:p>
+        </w:tc>
+      </w:tr>
+      <w:tr>
+        <w:trPr>
+          <w:cantSplit/>
+        </w:trPr>
+        <w:tc>
+          <w:tcPr>
+            <w:tcW w:type="dxa" w:w="792"/>
+            <w:vAlign w:val="center"/>
+            <w:tcMar>
+              <w:top w:w="70" w:type="dxa"/>
+              <w:left w:w="70" w:type="dxa"/>
+              <w:bottom w:w="70" w:type="dxa"/>
+              <w:right w:w="70" w:type="dxa"/>
+            </w:tcMar>
+          </w:tcPr>
+          <w:p>
+            <w:pPr>
+              <w:spacing w:after="40" w:before="40"/>
+            </w:pPr>
+            <w:r>
+              <w:rPr>
+                <w:rFonts w:ascii="Arial" w:hAnsi="Arial"/>
+                <w:b w:val="0"/>
+                <w:color w:val="000000"/>
+                <w:sz w:val="22"/>
+              </w:rPr>
+              <w:t>3</w:t>
+            </w:r>
+          </w:p>
+        </w:tc>
+        <w:tc>
+          <w:tcPr>
+            <w:tcW w:type="dxa" w:w="6624"/>
+            <w:vAlign w:val="center"/>
+            <w:tcMar>
+              <w:top w:w="70" w:type="dxa"/>
+              <w:left w:w="70" w:type="dxa"/>
+              <w:bottom w:w="70" w:type="dxa"/>
+              <w:right w:w="70" w:type="dxa"/>
+            </w:tcMar>
+          </w:tcPr>
+          <w:p>
+            <w:pPr>
+              <w:spacing w:after="40" w:before="40"/>
+            </w:pPr>
+            <w:r>
+              <w:rPr>
+                <w:rFonts w:ascii="Arial" w:hAnsi="Arial"/>
+                <w:b w:val="0"/>
+                <w:color w:val="000000"/>
+                <w:sz w:val="22"/>
+              </w:rPr>
+              <w:t>Absa</w:t>
+            </w:r>
+          </w:p>
+        </w:tc>
+        <w:tc>
+          <w:tcPr>
+            <w:tcW w:type="dxa" w:w="2232"/>
+            <w:vAlign w:val="center"/>
+            <w:tcMar>
+              <w:top w:w="70" w:type="dxa"/>
+              <w:left w:w="70" w:type="dxa"/>
+              <w:bottom w:w="70" w:type="dxa"/>
+              <w:right w:w="70" w:type="dxa"/>
+            </w:tcMar>
+          </w:tcPr>
+          <w:p>
+            <w:pPr>
+              <w:spacing w:after="40" w:before="40"/>
+            </w:pPr>
+            <w:r>
+              <w:rPr>
+                <w:rFonts w:ascii="Arial" w:hAnsi="Arial"/>
+                <w:b w:val="0"/>
+                <w:color w:val="000000"/>
+                <w:sz w:val="22"/>
+              </w:rPr>
+              <w:t>150</w:t>
+            </w:r>
+          </w:p>
+        </w:tc>
+      </w:tr>
+      <w:tr>
+        <w:trPr>
+          <w:cantSplit/>
+        </w:trPr>
+        <w:tc>
+          <w:tcPr>
+            <w:tcW w:type="dxa" w:w="792"/>
+            <w:vAlign w:val="center"/>
+            <w:tcMar>
+              <w:top w:w="70" w:type="dxa"/>
+              <w:left w:w="70" w:type="dxa"/>
+              <w:bottom w:w="70" w:type="dxa"/>
+              <w:right w:w="70" w:type="dxa"/>
+            </w:tcMar>
+          </w:tcPr>
+          <w:p>
+            <w:pPr>
+              <w:spacing w:after="40" w:before="40"/>
+            </w:pPr>
+            <w:r>
+              <w:rPr>
+                <w:rFonts w:ascii="Arial" w:hAnsi="Arial"/>
+                <w:b w:val="0"/>
+                <w:color w:val="000000"/>
+                <w:sz w:val="22"/>
+              </w:rPr>
+              <w:t>4</w:t>
+            </w:r>
+          </w:p>
+        </w:tc>
+        <w:tc>
+          <w:tcPr>
+            <w:tcW w:type="dxa" w:w="6624"/>
+            <w:vAlign w:val="center"/>
+            <w:tcMar>
+              <w:top w:w="70" w:type="dxa"/>
+              <w:left w:w="70" w:type="dxa"/>
+              <w:bottom w:w="70" w:type="dxa"/>
+              <w:right w:w="70" w:type="dxa"/>
+            </w:tcMar>
+          </w:tcPr>
+          <w:p>
+            <w:pPr>
+              <w:spacing w:after="40" w:before="40"/>
+            </w:pPr>
+            <w:r>
+              <w:rPr>
+                <w:rFonts w:ascii="Arial" w:hAnsi="Arial"/>
+                <w:b w:val="0"/>
+                <w:color w:val="000000"/>
+                <w:sz w:val="22"/>
+              </w:rPr>
+              <w:t>Nedbank</w:t>
+            </w:r>
+          </w:p>
+        </w:tc>
+        <w:tc>
+          <w:tcPr>
+            <w:tcW w:type="dxa" w:w="2232"/>
+            <w:vAlign w:val="center"/>
+            <w:tcMar>
+              <w:top w:w="70" w:type="dxa"/>
+              <w:left w:w="70" w:type="dxa"/>
+              <w:bottom w:w="70" w:type="dxa"/>
+              <w:right w:w="70" w:type="dxa"/>
+            </w:tcMar>
+          </w:tcPr>
+          <w:p>
+            <w:pPr>
+              <w:spacing w:after="40" w:before="40"/>
+            </w:pPr>
+            <w:r>
+              <w:rPr>
+                <w:rFonts w:ascii="Arial" w:hAnsi="Arial"/>
+                <w:b w:val="0"/>
+                <w:color w:val="000000"/>
+                <w:sz w:val="22"/>
+              </w:rPr>
+              <w:t>140</w:t>
+            </w:r>
+          </w:p>
+        </w:tc>
+      </w:tr>
+      <w:tr>
+        <w:trPr>
+          <w:cantSplit/>
+        </w:trPr>
+        <w:tc>
+          <w:tcPr>
+            <w:tcW w:type="dxa" w:w="792"/>
+            <w:vAlign w:val="center"/>
+            <w:tcMar>
+              <w:top w:w="70" w:type="dxa"/>
+              <w:left w:w="70" w:type="dxa"/>
+              <w:bottom w:w="70" w:type="dxa"/>
+              <w:right w:w="70" w:type="dxa"/>
+            </w:tcMar>
+          </w:tcPr>
+          <w:p>
+            <w:pPr>
+              <w:spacing w:after="40" w:before="40"/>
+            </w:pPr>
+            <w:r>
+              <w:rPr>
+                <w:rFonts w:ascii="Arial" w:hAnsi="Arial"/>
+                <w:b w:val="0"/>
+                <w:color w:val="000000"/>
+                <w:sz w:val="22"/>
+              </w:rPr>
+              <w:t>5</w:t>
+            </w:r>
+          </w:p>
+        </w:tc>
+        <w:tc>
+          <w:tcPr>
+            <w:tcW w:type="dxa" w:w="6624"/>
+            <w:vAlign w:val="center"/>
+            <w:tcMar>
+              <w:top w:w="70" w:type="dxa"/>
+              <w:left w:w="70" w:type="dxa"/>
+              <w:bottom w:w="70" w:type="dxa"/>
+              <w:right w:w="70" w:type="dxa"/>
+            </w:tcMar>
+          </w:tcPr>
+          <w:p>
+            <w:pPr>
+              <w:spacing w:after="40" w:before="40"/>
+            </w:pPr>
+            <w:r>
+              <w:rPr>
+                <w:rFonts w:ascii="Arial" w:hAnsi="Arial"/>
+                <w:b w:val="0"/>
+                <w:color w:val="000000"/>
+                <w:sz w:val="22"/>
+              </w:rPr>
+              <w:t>Capitec</w:t>
+            </w:r>
+          </w:p>
+        </w:tc>
+        <w:tc>
+          <w:tcPr>
+            <w:tcW w:type="dxa" w:w="2232"/>
+            <w:vAlign w:val="center"/>
+            <w:tcMar>
+              <w:top w:w="70" w:type="dxa"/>
+              <w:left w:w="70" w:type="dxa"/>
+              <w:bottom w:w="70" w:type="dxa"/>
+              <w:right w:w="70" w:type="dxa"/>
+            </w:tcMar>
+          </w:tcPr>
+          <w:p>
+            <w:pPr>
+              <w:spacing w:after="40" w:before="40"/>
+            </w:pPr>
+            <w:r>
+              <w:rPr>
+                <w:rFonts w:ascii="Arial" w:hAnsi="Arial"/>
+                <w:b w:val="0"/>
+                <w:color w:val="000000"/>
+                <w:sz w:val="22"/>
+              </w:rPr>
+              <w:t>180</w:t>
+            </w:r>
+          </w:p>
+        </w:tc>
+      </w:tr>
+      <w:tr>
+        <w:trPr>
+          <w:cantSplit/>
+        </w:trPr>
+        <w:tc>
+          <w:tcPr>
+            <w:tcW w:type="dxa" w:w="792"/>
+            <w:vAlign w:val="center"/>
+            <w:tcMar>
+              <w:top w:w="70" w:type="dxa"/>
+              <w:left w:w="70" w:type="dxa"/>
+              <w:bottom w:w="70" w:type="dxa"/>
+              <w:right w:w="70" w:type="dxa"/>
+            </w:tcMar>
+          </w:tcPr>
+          <w:p>
+            <w:pPr>
+              <w:spacing w:after="40" w:before="40"/>
+            </w:pPr>
+            <w:r>
+              <w:rPr>
+                <w:rFonts w:ascii="Arial" w:hAnsi="Arial"/>
+                <w:b w:val="0"/>
+                <w:color w:val="000000"/>
+                <w:sz w:val="22"/>
+              </w:rPr>
+              <w:t>6</w:t>
+            </w:r>
+          </w:p>
+        </w:tc>
+        <w:tc>
+          <w:tcPr>
+            <w:tcW w:type="dxa" w:w="6624"/>
+            <w:vAlign w:val="center"/>
+            <w:tcMar>
+              <w:top w:w="70" w:type="dxa"/>
+              <w:left w:w="70" w:type="dxa"/>
+              <w:bottom w:w="70" w:type="dxa"/>
+              <w:right w:w="70" w:type="dxa"/>
+            </w:tcMar>
+          </w:tcPr>
+          <w:p>
+            <w:pPr>
+              <w:spacing w:after="40" w:before="40"/>
+            </w:pPr>
+            <w:r>
+              <w:rPr>
+                <w:rFonts w:ascii="Arial" w:hAnsi="Arial"/>
+                <w:b w:val="0"/>
+                <w:color w:val="000000"/>
+                <w:sz w:val="22"/>
+              </w:rPr>
+              <w:t>Discovery Bank</w:t>
+            </w:r>
+          </w:p>
+        </w:tc>
+        <w:tc>
+          <w:tcPr>
+            <w:tcW w:type="dxa" w:w="2232"/>
+            <w:vAlign w:val="center"/>
+            <w:tcMar>
+              <w:top w:w="70" w:type="dxa"/>
+              <w:left w:w="70" w:type="dxa"/>
+              <w:bottom w:w="70" w:type="dxa"/>
+              <w:right w:w="70" w:type="dxa"/>
+            </w:tcMar>
+          </w:tcPr>
+          <w:p>
+            <w:pPr>
+              <w:spacing w:after="40" w:before="40"/>
+            </w:pPr>
+            <w:r>
+              <w:rPr>
+                <w:rFonts w:ascii="Arial" w:hAnsi="Arial"/>
+                <w:b w:val="0"/>
+                <w:color w:val="000000"/>
+                <w:sz w:val="22"/>
+              </w:rPr>
+              <w:t>90</w:t>
+            </w:r>
+          </w:p>
+        </w:tc>
+      </w:tr>
+      <w:tr>
+        <w:trPr>
+          <w:cantSplit/>
+        </w:trPr>
+        <w:tc>
+          <w:tcPr>
+            <w:tcW w:type="dxa" w:w="792"/>
+            <w:vAlign w:val="center"/>
+            <w:tcMar>
+              <w:top w:w="70" w:type="dxa"/>
+              <w:left w:w="70" w:type="dxa"/>
+              <w:bottom w:w="70" w:type="dxa"/>
+              <w:right w:w="70" w:type="dxa"/>
+            </w:tcMar>
+          </w:tcPr>
+          <w:p>
+            <w:pPr>
+              <w:spacing w:after="40" w:before="40"/>
+            </w:pPr>
+            <w:r>
+              <w:rPr>
+                <w:rFonts w:ascii="Arial" w:hAnsi="Arial"/>
+                <w:b w:val="0"/>
+                <w:color w:val="000000"/>
+                <w:sz w:val="22"/>
+              </w:rPr>
+              <w:t>7</w:t>
+            </w:r>
+          </w:p>
+        </w:tc>
+        <w:tc>
+          <w:tcPr>
+            <w:tcW w:type="dxa" w:w="6624"/>
+            <w:vAlign w:val="center"/>
+            <w:tcMar>
+              <w:top w:w="70" w:type="dxa"/>
+              <w:left w:w="70" w:type="dxa"/>
+              <w:bottom w:w="70" w:type="dxa"/>
+              <w:right w:w="70" w:type="dxa"/>
+            </w:tcMar>
+          </w:tcPr>
+          <w:p>
+            <w:pPr>
+              <w:spacing w:after="40" w:before="40"/>
+            </w:pPr>
+            <w:r>
+              <w:rPr>
+                <w:rFonts w:ascii="Arial" w:hAnsi="Arial"/>
+                <w:b w:val="0"/>
+                <w:color w:val="000000"/>
+                <w:sz w:val="22"/>
+              </w:rPr>
+              <w:t>GoTyme Bank (formerly TymeBank)</w:t>
+            </w:r>
+          </w:p>
+        </w:tc>
+        <w:tc>
+          <w:tcPr>
+            <w:tcW w:type="dxa" w:w="2232"/>
+            <w:vAlign w:val="center"/>
+            <w:tcMar>
+              <w:top w:w="70" w:type="dxa"/>
+              <w:left w:w="70" w:type="dxa"/>
+              <w:bottom w:w="70" w:type="dxa"/>
+              <w:right w:w="70" w:type="dxa"/>
+            </w:tcMar>
+          </w:tcPr>
+          <w:p>
+            <w:pPr>
+              <w:spacing w:after="40" w:before="40"/>
+            </w:pPr>
+            <w:r>
+              <w:rPr>
+                <w:rFonts w:ascii="Arial" w:hAnsi="Arial"/>
+                <w:b w:val="0"/>
+                <w:color w:val="000000"/>
+                <w:sz w:val="22"/>
+              </w:rPr>
+              <w:t>80</w:t>
+            </w:r>
+          </w:p>
+        </w:tc>
+      </w:tr>
+    </w:tbl>
+    <w:p>
+      <w:pPr>
+        <w:pStyle w:val="Heading1"/>
+      </w:pPr>
+      <w:r>
+        <w:t>Recall and interview order</w:t>
       </w:r>
     </w:p>
     <w:p>
       <w:pPr>
-        <w:spacing w:after="60"/>
+        <w:spacing w:after="80" w:line="240" w:lineRule="auto"/>
       </w:pPr>
       <w:r>
-        <w:t>Keep all original current-customer and channel data. Add a separate synthetic quota supplement of 500 FNB noncustomers in each wave. They are current sector users but have no current use of FNB in any capacity. Use new anonymous IDs and unit weights, with approximately balanced alternative main providers. This is a demonstration design, not a population target or market-share sample. Do not pool its base with the 1,000 current customers per wave.</w:t>
+        <w:t>Ask company measures before detailed experience questions. Company ratings cover the past three months or since joining if shorter. Screen channel use over the past 30 days, then ask only the latest interaction in each used channel. Recalled contact counts are not a register of every interaction.</w:t>
       </w:r>
     </w:p>
     <w:p>
       <w:pPr>
         <w:pStyle w:val="Heading1"/>
-        <w:spacing w:after="60" w:before="120"/>
+        <w:pageBreakBefore/>
       </w:pPr>
       <w:r>
-        <w:rPr>
-          <w:color w:val="000000"/>
-        </w:rPr>
-        <w:t>Deliverables</w:t>
+        <w:t>Two linked instruments and data grains</w:t>
       </w:r>
     </w:p>
     <w:p>
       <w:pPr>
-        <w:spacing w:after="60"/>
+        <w:spacing w:after="80" w:line="240" w:lineRule="auto"/>
       </w:pPr>
       <w:r>
-        <w:t>Provide a programmed questionnaire, three relationship datasets and three channel-experience datasets, embedded labels, a master codebook, metric definitions and reproducible chart data. Present a dashboard specification with separate relationship and channel views, waves, companies, channel, reason, product and demographic filters. Supply editable findings and recommendations grounded in actual bases and uncertainty.</w:t>
+        <w:t>Collect eligibility and company ratings before detailed channel questions. The company instrument also captures loyalty, complaints, channel use, one independently anchored recent task and eligible competitor follow up. Ask the channel instrument once for the latest experience in each used channel. Carry shared context and the canonical weight rather than asking these again.</w:t>
       </w:r>
     </w:p>
+    <w:tbl>
+      <w:tblPr>
+        <w:tblW w:type="auto" w:w="0"/>
+        <w:jc w:val="center"/>
+        <w:tblLayout w:type="fixed"/>
+        <w:tblLook w:firstColumn="1" w:firstRow="1" w:lastColumn="0" w:lastRow="0" w:noHBand="0" w:noVBand="1" w:val="04A0"/>
+      </w:tblPr>
+      <w:tblGrid>
+        <w:gridCol w:w="1224"/>
+        <w:gridCol w:w="3384"/>
+        <w:gridCol w:w="5040"/>
+      </w:tblGrid>
+      <w:tr>
+        <w:trPr>
+          <w:cantSplit/>
+          <w:tblHeader/>
+        </w:trPr>
+        <w:tc>
+          <w:tcPr>
+            <w:tcW w:type="dxa" w:w="1224"/>
+            <w:vAlign w:val="center"/>
+            <w:tcMar>
+              <w:top w:w="70" w:type="dxa"/>
+              <w:left w:w="70" w:type="dxa"/>
+              <w:bottom w:w="70" w:type="dxa"/>
+              <w:right w:w="70" w:type="dxa"/>
+            </w:tcMar>
+            <w:shd w:fill="EDEDED"/>
+          </w:tcPr>
+          <w:p>
+            <w:pPr>
+              <w:spacing w:after="40" w:before="40"/>
+            </w:pPr>
+            <w:r>
+              <w:rPr>
+                <w:rFonts w:ascii="Arial" w:hAnsi="Arial"/>
+                <w:b/>
+                <w:color w:val="000000"/>
+                <w:sz w:val="22"/>
+              </w:rPr>
+              <w:t>Channel code</w:t>
+            </w:r>
+          </w:p>
+        </w:tc>
+        <w:tc>
+          <w:tcPr>
+            <w:tcW w:type="dxa" w:w="3384"/>
+            <w:vAlign w:val="center"/>
+            <w:tcMar>
+              <w:top w:w="70" w:type="dxa"/>
+              <w:left w:w="70" w:type="dxa"/>
+              <w:bottom w:w="70" w:type="dxa"/>
+              <w:right w:w="70" w:type="dxa"/>
+            </w:tcMar>
+            <w:shd w:fill="EDEDED"/>
+          </w:tcPr>
+          <w:p>
+            <w:pPr>
+              <w:spacing w:after="40" w:before="40"/>
+            </w:pPr>
+            <w:r>
+              <w:rPr>
+                <w:rFonts w:ascii="Arial" w:hAnsi="Arial"/>
+                <w:b/>
+                <w:color w:val="000000"/>
+                <w:sz w:val="22"/>
+              </w:rPr>
+              <w:t>Module</w:t>
+            </w:r>
+          </w:p>
+        </w:tc>
+        <w:tc>
+          <w:tcPr>
+            <w:tcW w:type="dxa" w:w="5040"/>
+            <w:vAlign w:val="center"/>
+            <w:tcMar>
+              <w:top w:w="70" w:type="dxa"/>
+              <w:left w:w="70" w:type="dxa"/>
+              <w:bottom w:w="70" w:type="dxa"/>
+              <w:right w:w="70" w:type="dxa"/>
+            </w:tcMar>
+            <w:shd w:fill="EDEDED"/>
+          </w:tcPr>
+          <w:p>
+            <w:pPr>
+              <w:spacing w:after="40" w:before="40"/>
+            </w:pPr>
+            <w:r>
+              <w:rPr>
+                <w:rFonts w:ascii="Arial" w:hAnsi="Arial"/>
+                <w:b/>
+                <w:color w:val="000000"/>
+                <w:sz w:val="22"/>
+              </w:rPr>
+              <w:t>Record rule</w:t>
+            </w:r>
+          </w:p>
+        </w:tc>
+      </w:tr>
+      <w:tr>
+        <w:trPr>
+          <w:cantSplit/>
+        </w:trPr>
+        <w:tc>
+          <w:tcPr>
+            <w:tcW w:type="dxa" w:w="1224"/>
+            <w:vAlign w:val="center"/>
+            <w:tcMar>
+              <w:top w:w="70" w:type="dxa"/>
+              <w:left w:w="70" w:type="dxa"/>
+              <w:bottom w:w="70" w:type="dxa"/>
+              <w:right w:w="70" w:type="dxa"/>
+            </w:tcMar>
+          </w:tcPr>
+          <w:p>
+            <w:pPr>
+              <w:spacing w:after="40" w:before="40"/>
+            </w:pPr>
+            <w:r>
+              <w:rPr>
+                <w:rFonts w:ascii="Arial" w:hAnsi="Arial"/>
+                <w:b w:val="0"/>
+                <w:color w:val="000000"/>
+                <w:sz w:val="22"/>
+              </w:rPr>
+              <w:t>1</w:t>
+            </w:r>
+          </w:p>
+        </w:tc>
+        <w:tc>
+          <w:tcPr>
+            <w:tcW w:type="dxa" w:w="3384"/>
+            <w:vAlign w:val="center"/>
+            <w:tcMar>
+              <w:top w:w="70" w:type="dxa"/>
+              <w:left w:w="70" w:type="dxa"/>
+              <w:bottom w:w="70" w:type="dxa"/>
+              <w:right w:w="70" w:type="dxa"/>
+            </w:tcMar>
+          </w:tcPr>
+          <w:p>
+            <w:pPr>
+              <w:spacing w:after="40" w:before="40"/>
+            </w:pPr>
+            <w:r>
+              <w:rPr>
+                <w:rFonts w:ascii="Arial" w:hAnsi="Arial"/>
+                <w:b w:val="0"/>
+                <w:color w:val="000000"/>
+                <w:sz w:val="22"/>
+              </w:rPr>
+              <w:t>Call centre</w:t>
+            </w:r>
+          </w:p>
+        </w:tc>
+        <w:tc>
+          <w:tcPr>
+            <w:tcW w:type="dxa" w:w="5040"/>
+            <w:vAlign w:val="center"/>
+            <w:tcMar>
+              <w:top w:w="70" w:type="dxa"/>
+              <w:left w:w="70" w:type="dxa"/>
+              <w:bottom w:w="70" w:type="dxa"/>
+              <w:right w:w="70" w:type="dxa"/>
+            </w:tcMar>
+          </w:tcPr>
+          <w:p>
+            <w:pPr>
+              <w:spacing w:after="40" w:before="40"/>
+            </w:pPr>
+            <w:r>
+              <w:rPr>
+                <w:rFonts w:ascii="Arial" w:hAnsi="Arial"/>
+                <w:b w:val="0"/>
+                <w:color w:val="000000"/>
+                <w:sz w:val="22"/>
+              </w:rPr>
+              <w:t>Latest used experience in 30 days</w:t>
+            </w:r>
+          </w:p>
+        </w:tc>
+      </w:tr>
+      <w:tr>
+        <w:trPr>
+          <w:cantSplit/>
+        </w:trPr>
+        <w:tc>
+          <w:tcPr>
+            <w:tcW w:type="dxa" w:w="1224"/>
+            <w:vAlign w:val="center"/>
+            <w:tcMar>
+              <w:top w:w="70" w:type="dxa"/>
+              <w:left w:w="70" w:type="dxa"/>
+              <w:bottom w:w="70" w:type="dxa"/>
+              <w:right w:w="70" w:type="dxa"/>
+            </w:tcMar>
+          </w:tcPr>
+          <w:p>
+            <w:pPr>
+              <w:spacing w:after="40" w:before="40"/>
+            </w:pPr>
+            <w:r>
+              <w:rPr>
+                <w:rFonts w:ascii="Arial" w:hAnsi="Arial"/>
+                <w:b w:val="0"/>
+                <w:color w:val="000000"/>
+                <w:sz w:val="22"/>
+              </w:rPr>
+              <w:t>2</w:t>
+            </w:r>
+          </w:p>
+        </w:tc>
+        <w:tc>
+          <w:tcPr>
+            <w:tcW w:type="dxa" w:w="3384"/>
+            <w:vAlign w:val="center"/>
+            <w:tcMar>
+              <w:top w:w="70" w:type="dxa"/>
+              <w:left w:w="70" w:type="dxa"/>
+              <w:bottom w:w="70" w:type="dxa"/>
+              <w:right w:w="70" w:type="dxa"/>
+            </w:tcMar>
+          </w:tcPr>
+          <w:p>
+            <w:pPr>
+              <w:spacing w:after="40" w:before="40"/>
+            </w:pPr>
+            <w:r>
+              <w:rPr>
+                <w:rFonts w:ascii="Arial" w:hAnsi="Arial"/>
+                <w:b w:val="0"/>
+                <w:color w:val="000000"/>
+                <w:sz w:val="22"/>
+              </w:rPr>
+              <w:t>Branch</w:t>
+            </w:r>
+          </w:p>
+        </w:tc>
+        <w:tc>
+          <w:tcPr>
+            <w:tcW w:type="dxa" w:w="5040"/>
+            <w:vAlign w:val="center"/>
+            <w:tcMar>
+              <w:top w:w="70" w:type="dxa"/>
+              <w:left w:w="70" w:type="dxa"/>
+              <w:bottom w:w="70" w:type="dxa"/>
+              <w:right w:w="70" w:type="dxa"/>
+            </w:tcMar>
+          </w:tcPr>
+          <w:p>
+            <w:pPr>
+              <w:spacing w:after="40" w:before="40"/>
+            </w:pPr>
+            <w:r>
+              <w:rPr>
+                <w:rFonts w:ascii="Arial" w:hAnsi="Arial"/>
+                <w:b w:val="0"/>
+                <w:color w:val="000000"/>
+                <w:sz w:val="22"/>
+              </w:rPr>
+              <w:t>Latest used experience in 30 days</w:t>
+            </w:r>
+          </w:p>
+        </w:tc>
+      </w:tr>
+      <w:tr>
+        <w:trPr>
+          <w:cantSplit/>
+        </w:trPr>
+        <w:tc>
+          <w:tcPr>
+            <w:tcW w:type="dxa" w:w="1224"/>
+            <w:vAlign w:val="center"/>
+            <w:tcMar>
+              <w:top w:w="70" w:type="dxa"/>
+              <w:left w:w="70" w:type="dxa"/>
+              <w:bottom w:w="70" w:type="dxa"/>
+              <w:right w:w="70" w:type="dxa"/>
+            </w:tcMar>
+          </w:tcPr>
+          <w:p>
+            <w:pPr>
+              <w:spacing w:after="40" w:before="40"/>
+            </w:pPr>
+            <w:r>
+              <w:rPr>
+                <w:rFonts w:ascii="Arial" w:hAnsi="Arial"/>
+                <w:b w:val="0"/>
+                <w:color w:val="000000"/>
+                <w:sz w:val="22"/>
+              </w:rPr>
+              <w:t>3</w:t>
+            </w:r>
+          </w:p>
+        </w:tc>
+        <w:tc>
+          <w:tcPr>
+            <w:tcW w:type="dxa" w:w="3384"/>
+            <w:vAlign w:val="center"/>
+            <w:tcMar>
+              <w:top w:w="70" w:type="dxa"/>
+              <w:left w:w="70" w:type="dxa"/>
+              <w:bottom w:w="70" w:type="dxa"/>
+              <w:right w:w="70" w:type="dxa"/>
+            </w:tcMar>
+          </w:tcPr>
+          <w:p>
+            <w:pPr>
+              <w:spacing w:after="40" w:before="40"/>
+            </w:pPr>
+            <w:r>
+              <w:rPr>
+                <w:rFonts w:ascii="Arial" w:hAnsi="Arial"/>
+                <w:b w:val="0"/>
+                <w:color w:val="000000"/>
+                <w:sz w:val="22"/>
+              </w:rPr>
+              <w:t>Digital self service</w:t>
+            </w:r>
+          </w:p>
+        </w:tc>
+        <w:tc>
+          <w:tcPr>
+            <w:tcW w:type="dxa" w:w="5040"/>
+            <w:vAlign w:val="center"/>
+            <w:tcMar>
+              <w:top w:w="70" w:type="dxa"/>
+              <w:left w:w="70" w:type="dxa"/>
+              <w:bottom w:w="70" w:type="dxa"/>
+              <w:right w:w="70" w:type="dxa"/>
+            </w:tcMar>
+          </w:tcPr>
+          <w:p>
+            <w:pPr>
+              <w:spacing w:after="40" w:before="40"/>
+            </w:pPr>
+            <w:r>
+              <w:rPr>
+                <w:rFonts w:ascii="Arial" w:hAnsi="Arial"/>
+                <w:b w:val="0"/>
+                <w:color w:val="000000"/>
+                <w:sz w:val="22"/>
+              </w:rPr>
+              <w:t>Keep app or website in digital_mode</w:t>
+            </w:r>
+          </w:p>
+        </w:tc>
+      </w:tr>
+      <w:tr>
+        <w:trPr>
+          <w:cantSplit/>
+        </w:trPr>
+        <w:tc>
+          <w:tcPr>
+            <w:tcW w:type="dxa" w:w="1224"/>
+            <w:vAlign w:val="center"/>
+            <w:tcMar>
+              <w:top w:w="70" w:type="dxa"/>
+              <w:left w:w="70" w:type="dxa"/>
+              <w:bottom w:w="70" w:type="dxa"/>
+              <w:right w:w="70" w:type="dxa"/>
+            </w:tcMar>
+          </w:tcPr>
+          <w:p>
+            <w:pPr>
+              <w:spacing w:after="40" w:before="40"/>
+            </w:pPr>
+            <w:r>
+              <w:rPr>
+                <w:rFonts w:ascii="Arial" w:hAnsi="Arial"/>
+                <w:b w:val="0"/>
+                <w:color w:val="000000"/>
+                <w:sz w:val="22"/>
+              </w:rPr>
+              <w:t>4</w:t>
+            </w:r>
+          </w:p>
+        </w:tc>
+        <w:tc>
+          <w:tcPr>
+            <w:tcW w:type="dxa" w:w="3384"/>
+            <w:vAlign w:val="center"/>
+            <w:tcMar>
+              <w:top w:w="70" w:type="dxa"/>
+              <w:left w:w="70" w:type="dxa"/>
+              <w:bottom w:w="70" w:type="dxa"/>
+              <w:right w:w="70" w:type="dxa"/>
+            </w:tcMar>
+          </w:tcPr>
+          <w:p>
+            <w:pPr>
+              <w:spacing w:after="40" w:before="40"/>
+            </w:pPr>
+            <w:r>
+              <w:rPr>
+                <w:rFonts w:ascii="Arial" w:hAnsi="Arial"/>
+                <w:b w:val="0"/>
+                <w:color w:val="000000"/>
+                <w:sz w:val="22"/>
+              </w:rPr>
+              <w:t>Messaging or live chat</w:t>
+            </w:r>
+          </w:p>
+        </w:tc>
+        <w:tc>
+          <w:tcPr>
+            <w:tcW w:type="dxa" w:w="5040"/>
+            <w:vAlign w:val="center"/>
+            <w:tcMar>
+              <w:top w:w="70" w:type="dxa"/>
+              <w:left w:w="70" w:type="dxa"/>
+              <w:bottom w:w="70" w:type="dxa"/>
+              <w:right w:w="70" w:type="dxa"/>
+            </w:tcMar>
+          </w:tcPr>
+          <w:p>
+            <w:pPr>
+              <w:spacing w:after="40" w:before="40"/>
+            </w:pPr>
+            <w:r>
+              <w:rPr>
+                <w:rFonts w:ascii="Arial" w:hAnsi="Arial"/>
+                <w:b w:val="0"/>
+                <w:color w:val="000000"/>
+                <w:sz w:val="22"/>
+              </w:rPr>
+              <w:t>Staff assisted interaction</w:t>
+            </w:r>
+          </w:p>
+        </w:tc>
+      </w:tr>
+    </w:tbl>
     <w:p>
       <w:pPr>
-        <w:spacing w:after="60"/>
+        <w:spacing w:after="80" w:line="240" w:lineRule="auto"/>
       </w:pPr>
       <w:r>
-        <w:t>Extend existing questionnaires, data columns, embedded metadata, codebooks, metric references and validators without recoding the original fields. Supply a separate noncustomer questionnaire and datasets. Use the written Claude implementation instructions for a later authorised app update; preserve the existing font, layout and #2563eb accent. No app changes or contact with Claude are part of this file update.</w:t>
+        <w:t>Unused channels create no Experiences row. Preserve the company channel use flags, none flag and recalled contact counts as original 0 or 1 or count values. A customer using four channels is still one person in company scores. Latest experiences from different channels need not concern the same task; never combine them into an invented journey.</w:t>
       </w:r>
     </w:p>
     <w:p>
       <w:pPr>
         <w:pStyle w:val="Heading1"/>
-        <w:spacing w:after="60" w:before="120"/>
       </w:pPr>
       <w:r>
-        <w:rPr>
-          <w:color w:val="000000"/>
-        </w:rPr>
-        <w:t>Acceptance</w:t>
+        <w:t>Deliverable contract</w:t>
       </w:r>
     </w:p>
     <w:p>
       <w:pPr>
-        <w:spacing w:after="60"/>
+        <w:pStyle w:val="ListBullet"/>
+        <w:spacing w:after="80" w:line="240" w:lineRule="auto"/>
       </w:pPr>
       <w:r>
-        <w:t>Use a fully labelled five-point satisfaction scale with 4–5 as top two. Keep NPS on 0–10 and ease on 1–7. Reverse interpretation, not raw data, for switching likelihood. Retain structural blanks and substantive pending outcomes. Show low bases. Do not claim observed churn, causal drivers, market rankings or certified ACSI/SERVQUAL scores from these fixtures. Cost the pilot, recruitment, fieldwork, weighting, processing and reporting separately. Agree consent, privacy, retention and access before real fieldwork.</w:t>
+        <w:t>Separate company and channel questionnaires and Master_CSM_Codebook.xlsx define this sector. Retain original unprefixed question IDs and variable names. The two formats measure identical constructs and contain matching answers; they are alternative representations, not additional samples.</w:t>
+      </w:r>
+    </w:p>
+    <w:p>
+      <w:pPr>
+        <w:pStyle w:val="ListBullet"/>
+        <w:spacing w:after="80" w:line="240" w:lineRule="auto"/>
+      </w:pPr>
+      <w:r>
+        <w:t>Three Banking_CSM_Relationship_Wave_N.xlsx workbooks contain 1,000 Respondents rows and 100 fields each. Three Banking_CSM_Channel_Wave_N.xlsx workbooks contain 88 Experiences fields and wave specific row counts. Matching CSV copies sit in test-reference. All 98 baseline company and 71 baseline channel fields are preserved; two company and 17 channel fields are additive.</w:t>
+      </w:r>
+    </w:p>
+    <w:p>
+      <w:pPr>
+        <w:pStyle w:val="ListBullet"/>
+        <w:spacing w:after="80" w:line="240" w:lineRule="auto"/>
+      </w:pPr>
+      <w:r>
+        <w:t>Banking_CSM_Relationship_All_Waves.xlsx concatenates 3,000 customers and Banking_CSM_Channel_All_Waves.xlsx concatenates 4,837 experiences, with unchanged waves and weights. Import per wave files or pooled files, never both. Choose separate or combined format, never both. Default to one wave; these are independent cross sections, not a panel.</w:t>
+      </w:r>
+    </w:p>
+    <w:p>
+      <w:pPr>
+        <w:pStyle w:val="ListBullet"/>
+        <w:spacing w:after="80" w:line="240" w:lineRule="auto"/>
+      </w:pPr>
+      <w:r>
+        <w:t>The dashboard and analysis guide, written Claude handoff and CSM_Reference_Metrics.xlsx support implementation and checking. The two questionnaires, matching codebook and separate company and channel XLSX files are sufficient for import; optional JSON is not a dependency.</w:t>
+      </w:r>
+    </w:p>
+    <w:p>
+      <w:pPr>
+        <w:spacing w:after="80" w:line="240" w:lineRule="auto"/>
+      </w:pPr>
+      <w:r>
+        <w:t>The optional noncustomer questionnaire and Banking_CSM_Noncustomer_Wave_N.xlsx workbooks remain separate and unchanged. Each wave has 500 independent FNB noncustomers with no current focal use, including secondary use, separate anonymous IDs and unit weights. Exclude them from current customer denominators. Expectations and consideration are not unexperienced focal satisfaction.</w:t>
+      </w:r>
+    </w:p>
+    <w:p>
+      <w:pPr>
+        <w:pStyle w:val="Heading1"/>
+      </w:pPr>
+      <w:r>
+        <w:t>Acceptance and fieldwork controls</w:t>
+      </w:r>
+    </w:p>
+    <w:p>
+      <w:pPr>
+        <w:spacing w:after="80" w:line="240" w:lineRule="auto"/>
+      </w:pPr>
+      <w:r>
+        <w:t>Preserve original values, codes, dates, IDs, weights, blanks and pending outcomes exactly. Add new synthetic responses without overwriting source fields. Test all modules; the expanded diagnostic modules can be optional in a separately specified real study. Keep labelled five point CSAT, NPS on 0 to 10 and ease on 1 to 7. Show valid bases and low base warnings; no causal, market ranking, observed churn or certified index claims are supported.</w:t>
+      </w:r>
+    </w:p>
+    <w:p>
+      <w:pPr>
+        <w:keepLines/>
+        <w:spacing w:after="80" w:line="240" w:lineRule="auto"/>
+      </w:pPr>
+      <w:r>
+        <w:t>Before fieldwork, agree consent, privacy, retention, access, recruitment and a pilot. Cost interviewing, weighting, processing and reporting separately. This delivery changes files only. Later app work must preserve the existing font and layout and sole #2563eb accent. App changes, deployment and contact with Claude need separate authorisation.</w:t>
       </w:r>
     </w:p>
     <w:sectPr>
       <w:footerReference w:type="default" r:id="rId9"/>
-      <w:pgSz w:w="12240" w:h="15840"/>
-      <w:pgMar w:top="936" w:right="1080" w:bottom="936" w:left="1080" w:header="720" w:footer="720" w:gutter="0"/>
+      <w:pgSz w:w="11909" w:h="16834"/>
+      <w:pgMar w:top="1008" w:right="1094" w:bottom="1008" w:left="1094" w:header="720" w:footer="432" w:gutter="0"/>
       <w:cols w:space="720"/>
       <w:docGrid w:linePitch="360"/>
     </w:sectPr>
@@ -161,7 +1324,11 @@
       <w:jc w:val="right"/>
     </w:pPr>
     <w:r>
-      <w:t xml:space="preserve">Customer satisfaction tracking | </w:t>
+      <w:rPr>
+        <w:rFonts w:ascii="Arial" w:hAnsi="Arial"/>
+        <w:color w:val="000000"/>
+        <w:sz w:val="18"/>
+      </w:rPr>
     </w:r>
     <w:fldSimple w:instr="PAGE"/>
   </w:p>
@@ -532,11 +1699,14 @@
     <w:qFormat/>
     <w:rsid w:val="00FC693F"/>
     <w:pPr>
-      <w:spacing w:after="80"/>
+      <w:widowControl/>
+      <w:spacing w:line="240" w:lineRule="auto" w:after="80"/>
     </w:pPr>
     <w:rPr>
-      <w:rFonts w:ascii="Calibri" w:hAnsi="Calibri"/>
-      <w:sz w:val="20"/>
+      <w:rFonts w:ascii="Arial" w:hAnsi="Arial"/>
+      <w:i w:val="0"/>
+      <w:color w:val="000000"/>
+      <w:sz w:val="22"/>
     </w:rPr>
   </w:style>
   <w:style w:type="paragraph" w:styleId="Header">
@@ -594,15 +1764,17 @@
     <w:pPr>
       <w:keepNext/>
       <w:keepLines/>
-      <w:spacing w:before="480" w:after="0"/>
+      <w:widowControl/>
+      <w:spacing w:before="180" w:after="100" w:line="252" w:lineRule="auto"/>
       <w:outlineLvl w:val="0"/>
     </w:pPr>
     <w:rPr>
-      <w:rFonts w:asciiTheme="majorHAnsi" w:eastAsiaTheme="majorEastAsia" w:hAnsiTheme="majorHAnsi" w:cstheme="majorBidi" w:ascii="Calibri" w:hAnsi="Calibri"/>
+      <w:rFonts w:asciiTheme="majorHAnsi" w:eastAsiaTheme="majorEastAsia" w:hAnsiTheme="majorHAnsi" w:cstheme="majorBidi" w:ascii="Arial" w:hAnsi="Arial"/>
       <w:b/>
       <w:bCs/>
+      <w:i w:val="0"/>
       <w:color w:val="000000"/>
-      <w:sz w:val="34"/>
+      <w:sz w:val="26"/>
       <w:szCs w:val="28"/>
     </w:rPr>
   </w:style>
@@ -618,15 +1790,17 @@
     <w:pPr>
       <w:keepNext/>
       <w:keepLines/>
-      <w:spacing w:before="200" w:after="0"/>
+      <w:widowControl/>
+      <w:spacing w:before="180" w:after="100" w:line="252" w:lineRule="auto"/>
       <w:outlineLvl w:val="1"/>
     </w:pPr>
     <w:rPr>
-      <w:rFonts w:asciiTheme="majorHAnsi" w:eastAsiaTheme="majorEastAsia" w:hAnsiTheme="majorHAnsi" w:cstheme="majorBidi" w:ascii="Calibri" w:hAnsi="Calibri"/>
+      <w:rFonts w:asciiTheme="majorHAnsi" w:eastAsiaTheme="majorEastAsia" w:hAnsiTheme="majorHAnsi" w:cstheme="majorBidi" w:ascii="Arial" w:hAnsi="Arial"/>
       <w:b/>
       <w:bCs/>
+      <w:i w:val="0"/>
       <w:color w:val="000000"/>
-      <w:sz w:val="24"/>
+      <w:sz w:val="22"/>
       <w:szCs w:val="26"/>
     </w:rPr>
   </w:style>
@@ -649,7 +1823,7 @@
       <w:rFonts w:asciiTheme="majorHAnsi" w:eastAsiaTheme="majorEastAsia" w:hAnsiTheme="majorHAnsi" w:cstheme="majorBidi"/>
       <w:b/>
       <w:bCs/>
-      <w:color w:val="000000"/>
+      <w:color w:val="4F81BD" w:themeColor="accent1"/>
     </w:rPr>
   </w:style>
   <w:style w:type="paragraph" w:styleId="Heading4">
@@ -880,15 +2054,19 @@
     <w:qFormat/>
     <w:rsid w:val="00FC693F"/>
     <w:pPr>
-      <w:spacing w:after="300" w:line="240" w:lineRule="auto"/>
+      <w:keepNext/>
+      <w:widowControl/>
+      <w:spacing w:after="100" w:line="252" w:lineRule="auto" w:before="0"/>
       <w:contextualSpacing/>
     </w:pPr>
     <w:rPr>
-      <w:rFonts w:asciiTheme="majorHAnsi" w:eastAsiaTheme="majorEastAsia" w:hAnsiTheme="majorHAnsi" w:cstheme="majorBidi" w:ascii="Calibri" w:hAnsi="Calibri"/>
+      <w:rFonts w:asciiTheme="majorHAnsi" w:eastAsiaTheme="majorEastAsia" w:hAnsiTheme="majorHAnsi" w:cstheme="majorBidi" w:ascii="Arial" w:hAnsi="Arial"/>
+      <w:b/>
+      <w:i w:val="0"/>
       <w:color w:val="000000"/>
       <w:spacing w:val="5"/>
       <w:kern w:val="28"/>
-      <w:sz w:val="44"/>
+      <w:sz w:val="36"/>
       <w:szCs w:val="52"/>
     </w:rPr>
   </w:style>
@@ -916,17 +2094,19 @@
     <w:qFormat/>
     <w:rsid w:val="00FC693F"/>
     <w:pPr>
+      <w:widowControl/>
       <w:numPr>
         <w:ilvl w:val="1"/>
       </w:numPr>
+      <w:spacing w:line="252" w:lineRule="auto" w:after="240"/>
     </w:pPr>
     <w:rPr>
-      <w:rFonts w:asciiTheme="majorHAnsi" w:eastAsiaTheme="majorEastAsia" w:hAnsiTheme="majorHAnsi" w:cstheme="majorBidi"/>
-      <w:i/>
+      <w:rFonts w:asciiTheme="majorHAnsi" w:eastAsiaTheme="majorEastAsia" w:hAnsiTheme="majorHAnsi" w:cstheme="majorBidi" w:ascii="Arial" w:hAnsi="Arial"/>
+      <w:i w:val="0"/>
       <w:iCs/>
-      <w:color w:val="4F81BD" w:themeColor="accent1"/>
+      <w:color w:val="000000"/>
       <w:spacing w:val="15"/>
-      <w:sz w:val="24"/>
+      <w:sz w:val="22"/>
       <w:szCs w:val="24"/>
     </w:rPr>
   </w:style>
@@ -1059,11 +2239,19 @@
     <w:unhideWhenUsed/>
     <w:rsid w:val="00326F90"/>
     <w:pPr>
+      <w:widowControl/>
       <w:numPr>
         <w:numId w:val="1"/>
       </w:numPr>
+      <w:spacing w:line="240" w:lineRule="auto" w:after="80"/>
       <w:contextualSpacing/>
     </w:pPr>
+    <w:rPr>
+      <w:rFonts w:ascii="Arial" w:hAnsi="Arial"/>
+      <w:i w:val="0"/>
+      <w:color w:val="000000"/>
+      <w:sz w:val="22"/>
+    </w:rPr>
   </w:style>
   <w:style w:type="paragraph" w:styleId="ListBullet2">
     <w:name w:val="List Bullet 2"/>
@@ -1098,11 +2286,19 @@
     <w:unhideWhenUsed/>
     <w:rsid w:val="00326F90"/>
     <w:pPr>
+      <w:widowControl/>
       <w:numPr>
         <w:numId w:val="5"/>
       </w:numPr>
+      <w:spacing w:line="252" w:lineRule="auto" w:after="120"/>
       <w:contextualSpacing/>
     </w:pPr>
+    <w:rPr>
+      <w:rFonts w:ascii="Arial" w:hAnsi="Arial"/>
+      <w:i w:val="0"/>
+      <w:color w:val="000000"/>
+      <w:sz w:val="22"/>
+    </w:rPr>
   </w:style>
   <w:style w:type="paragraph" w:styleId="ListNumber2">
     <w:name w:val="List Number 2"/>
@@ -1364,6 +2560,9 @@
     <w:qFormat/>
     <w:rsid w:val="00FC693F"/>
     <w:pPr>
+      <w:pBdr>
+        <w:bottom w:val="single" w:sz="4" w:space="4" w:color="4F81BD" w:themeColor="accent1"/>
+      </w:pBdr>
       <w:spacing w:before="200" w:after="280"/>
       <w:ind w:left="936" w:right="936"/>
     </w:pPr>

</xml_diff>